<commit_message>
TP2 orga de datos
</commit_message>
<xml_diff>
--- a/Organizacion_de_Datos/TP2.docx
+++ b/Organizacion_de_Datos/TP2.docx
@@ -4377,6 +4377,7 @@
       <w:r>
         <w:rPr>
           <w:rFonts w:ascii="Consolas" w:hAnsi="Consolas"/>
+          <w:noProof/>
         </w:rPr>
         <w:drawing>
           <wp:inline distT="0" distB="0" distL="0" distR="0" wp14:anchorId="3E07EBB4" wp14:editId="50EA1E26">
@@ -4533,6 +4534,7 @@
       <w:r>
         <w:rPr>
           <w:rFonts w:ascii="Arial Narrow" w:hAnsi="Arial Narrow"/>
+          <w:noProof/>
         </w:rPr>
         <w:drawing>
           <wp:inline distT="0" distB="0" distL="0" distR="0" wp14:anchorId="5108F9A1" wp14:editId="6935FE22">
@@ -4675,7 +4677,20 @@
         <w:rPr>
           <w:rFonts w:ascii="Arial Narrow" w:hAnsi="Arial Narrow"/>
         </w:rPr>
-        <w:t>Complejidad: O(n*2)</w:t>
+        <w:t>Complejidad: O(n</w:t>
+      </w:r>
+      <w:r>
+        <w:rPr>
+          <w:rFonts w:ascii="Arial Narrow" w:hAnsi="Arial Narrow"/>
+          <w:vertAlign w:val="superscript"/>
+        </w:rPr>
+        <w:t>2</w:t>
+      </w:r>
+      <w:r>
+        <w:rPr>
+          <w:rFonts w:ascii="Arial Narrow" w:hAnsi="Arial Narrow"/>
+        </w:rPr>
+        <w:t>)</w:t>
       </w:r>
     </w:p>
     <w:p>
@@ -4689,6 +4704,7 @@
       <w:r>
         <w:rPr>
           <w:rFonts w:ascii="Arial Narrow" w:hAnsi="Arial Narrow"/>
+          <w:noProof/>
         </w:rPr>
         <w:drawing>
           <wp:inline distT="0" distB="0" distL="0" distR="0" wp14:anchorId="03787B56" wp14:editId="4020559A">
@@ -4887,7 +4903,23 @@
                 <w:b/>
                 <w:bCs/>
               </w:rPr>
-              <w:t>Cokctail</w:t>
+              <w:t>Coc</w:t>
+            </w:r>
+            <w:r>
+              <w:rPr>
+                <w:rFonts w:ascii="Arial Narrow" w:hAnsi="Arial Narrow"/>
+                <w:b/>
+                <w:bCs/>
+              </w:rPr>
+              <w:t>k</w:t>
+            </w:r>
+            <w:r>
+              <w:rPr>
+                <w:rFonts w:ascii="Arial Narrow" w:hAnsi="Arial Narrow"/>
+                <w:b/>
+                <w:bCs/>
+              </w:rPr>
+              <w:t>tail</w:t>
             </w:r>
             <w:proofErr w:type="spellEnd"/>
             <w:r>
@@ -5196,6 +5228,7 @@
           </w:tcPr>
           <w:p>
             <w:pPr>
+              <w:ind w:left="720" w:hanging="720"/>
               <w:jc w:val="center"/>
               <w:rPr>
                 <w:rFonts w:ascii="Arial Narrow" w:hAnsi="Arial Narrow"/>
@@ -5208,7 +5241,20 @@
               <w:rPr>
                 <w:rFonts w:ascii="Arial Narrow" w:hAnsi="Arial Narrow"/>
               </w:rPr>
-              <w:t>O(n*2)</w:t>
+              <w:t>O(n</w:t>
+            </w:r>
+            <w:r>
+              <w:rPr>
+                <w:rFonts w:ascii="Arial Narrow" w:hAnsi="Arial Narrow"/>
+                <w:vertAlign w:val="superscript"/>
+              </w:rPr>
+              <w:t>2</w:t>
+            </w:r>
+            <w:r>
+              <w:rPr>
+                <w:rFonts w:ascii="Arial Narrow" w:hAnsi="Arial Narrow"/>
+              </w:rPr>
+              <w:t>)</w:t>
             </w:r>
           </w:p>
         </w:tc>
@@ -6631,6 +6677,7 @@
   <w:style w:type="character" w:default="1" w:styleId="Fuentedeprrafopredeter">
     <w:name w:val="Default Paragraph Font"/>
     <w:uiPriority w:val="1"/>
+    <w:semiHidden/>
     <w:unhideWhenUsed/>
   </w:style>
   <w:style w:type="table" w:default="1" w:styleId="Tablanormal">

</xml_diff>